<commit_message>
Broaden search coverage: name variants, full-page reading, more sources
- Name variants (-a/--alias): every source is searched for each form of the
  name, with and without the location; alias + topic words counts as a full
  match; hyphen/space forms are added automatically.
- Page reading: open the top results (HTML and PDF), keep excerpts around
  name/topic/location mentions, use them for scoring, and drop readable
  pages that never mention the name (social pages are never dropped).
- New sources: Texas-only news (Google News site: on local outlets),
  Texas institutions (web search site: on universities/government),
  OpenAlex, Crossref, Semantic Scholar (author lookup), Wikipedia,
  podcasts (iTunes) and Bluesky.
- Web search reads up to 3 result pages; requests to each host are
  spaced out so free endpoints don't block the run.

Co-Authored-By: Claude Opus 5.5 <noreply@anthropic.com>
Claude-Session: https://claude.ai/code/session_01QoFTAf8Txm3VXryr2oQFBG
</commit_message>
<xml_diff>
--- a/reports/Ana_Andrei_Philosophy_Texas_Report.docx
+++ b/reports/Ana_Andrei_Philosophy_Texas_Report.docx
@@ -78,6 +78,28 @@
           </w:tcPr>
           <w:p>
             <w:r>
+              <w:t>Name variants searched</w:t>
+            </w:r>
+          </w:p>
+        </w:tc>
+        <w:tc>
+          <w:tcPr>
+            <w:tcW w:type="dxa" w:w="4320"/>
+          </w:tcPr>
+          <w:p>
+            <w:r>
+              <w:t>Ana-Maria Andrei, Ana Maria Andrei</w:t>
+            </w:r>
+          </w:p>
+        </w:tc>
+      </w:tr>
+      <w:tr>
+        <w:tc>
+          <w:tcPr>
+            <w:tcW w:type="dxa" w:w="4320"/>
+          </w:tcPr>
+          <w:p>
+            <w:r>
               <w:t>Location focus</w:t>
             </w:r>
           </w:p>
@@ -132,7 +154,7 @@
           </w:tcPr>
           <w:p>
             <w:r>
-              <w:t>2026-09-24 18:18</w:t>
+              <w:t>2026-09-24 18:54</w:t>
             </w:r>
           </w:p>
         </w:tc>
@@ -359,6 +381,38 @@
           <w:p>
             <w:r>
               <w:t>5</w:t>
+            </w:r>
+          </w:p>
+        </w:tc>
+        <w:tc>
+          <w:tcPr>
+            <w:tcW w:type="dxa" w:w="2880"/>
+          </w:tcPr>
+          <w:p>
+            <w:r>
+              <w:t>0</w:t>
+            </w:r>
+          </w:p>
+        </w:tc>
+      </w:tr>
+      <w:tr>
+        <w:tc>
+          <w:tcPr>
+            <w:tcW w:type="dxa" w:w="2880"/>
+          </w:tcPr>
+          <w:p>
+            <w:r>
+              <w:t>Media</w:t>
+            </w:r>
+          </w:p>
+        </w:tc>
+        <w:tc>
+          <w:tcPr>
+            <w:tcW w:type="dxa" w:w="2880"/>
+          </w:tcPr>
+          <w:p>
+            <w:r>
+              <w:t>0</w:t>
             </w:r>
           </w:p>
         </w:tc>
@@ -1387,7 +1441,7 @@
           <w:color w:val="595959"/>
           <w:sz w:val="18"/>
         </w:rPr>
-        <w:t>TikTok | date unknown | relevance 0.40</w:t>
+        <w:t>TikTok | date unknown | relevance 0.45</w:t>
       </w:r>
     </w:p>
     <w:p>
@@ -1422,7 +1476,7 @@
           <w:color w:val="595959"/>
           <w:sz w:val="18"/>
         </w:rPr>
-        <w:t>TikTok | date unknown | relevance 0.40</w:t>
+        <w:t>TikTok | date unknown | relevance 0.45</w:t>
       </w:r>
     </w:p>
     <w:p>
@@ -1457,7 +1511,7 @@
           <w:color w:val="595959"/>
           <w:sz w:val="18"/>
         </w:rPr>
-        <w:t>TikTok | date unknown | relevance 0.40</w:t>
+        <w:t>TikTok | date unknown | relevance 0.45</w:t>
       </w:r>
     </w:p>
     <w:p>
@@ -1492,7 +1546,7 @@
           <w:color w:val="595959"/>
           <w:sz w:val="18"/>
         </w:rPr>
-        <w:t>TikTok | date unknown | relevance 0.40</w:t>
+        <w:t>TikTok | date unknown | relevance 0.45</w:t>
       </w:r>
     </w:p>
     <w:p>
@@ -1527,7 +1581,7 @@
           <w:color w:val="595959"/>
           <w:sz w:val="18"/>
         </w:rPr>
-        <w:t>TikTok | date unknown | relevance 0.40</w:t>
+        <w:t>TikTok | date unknown | relevance 0.45</w:t>
       </w:r>
     </w:p>
     <w:p>
@@ -1693,7 +1747,23 @@
         <w:pStyle w:val="ListBullet"/>
       </w:pPr>
       <w:r>
-        <w:t>Each source was queried with the keyword plus the location term, and with the bare keyword.</w:t>
+        <w:t>Each source was queried with the keyword and each name variant, with and without the location term. Academic databases (OpenAlex, Crossref, Semantic Scholar) were searched by author name.</w:t>
+      </w:r>
+    </w:p>
+    <w:p>
+      <w:pPr>
+        <w:pStyle w:val="ListBullet"/>
+      </w:pPr>
+      <w:r>
+        <w:t>Local sources searched only inside the location's own news outlets and institutions.</w:t>
+      </w:r>
+    </w:p>
+    <w:p>
+      <w:pPr>
+        <w:pStyle w:val="ListBullet"/>
+      </w:pPr>
+      <w:r>
+        <w:t>The top results' pages were opened and read in full (including PDFs). Text around name, topic and location mentions was used for scoring; pages that were readable but never mention the name were dropped.</w:t>
       </w:r>
     </w:p>
     <w:p>
@@ -1709,7 +1779,7 @@
         <w:pStyle w:val="ListBullet"/>
       </w:pPr>
       <w:r>
-        <w:t>Keyword score = share of keyword terms present in title/snippet/URL (+0.2 for exact phrase).</w:t>
+        <w:t>Keyword score = share of keyword terms present in title/snippet/URL/page text (+0.2 for exact phrase); a name variant plus the topic words counts as a full match.</w:t>
       </w:r>
     </w:p>
     <w:p>

</xml_diff>